<commit_message>
fix: revisa documentacao e portabilidade da etapa 4  Copiar
Ajusta a documentação da seleção do limiar, esclarece o caráter exploratório da comparação no conjunto de teste e corrige a portabilidade do notebook. Mantém os resultados e os arquivos de dados originais.
</commit_message>
<xml_diff>
--- a/Etapa 4/Relatorio_Machine_Learning_WineQT.docx
+++ b/Etapa 4/Relatorio_Machine_Learning_WineQT.docx
@@ -458,6 +458,16 @@
         <w:br/>
         <w:t>A AUC-ROC permaneceu em 0,9317, pois a alteração do limiar não modifica as probabilidades nem sua ordenação. O limiar foi selecionado na validação, e não a partir do desempenho final no teste.</w:t>
       </w:r>
+      <w:r>
+        <w:br/>
+        <w:br/>
+        <w:t>O notebook também apresenta uma comparação exploratória de limiares calculada no conjunto de teste. Essa comparação é apenas descritiva e não foi utilizada para selecionar o limiar final; a escolha de 0,25 foi feita exclusivamente com as probabilidades fora da dobra na validação cruzada do conjunto de treinamento.</w:t>
+      </w:r>
+      <w:r>
+        <w:br/>
+        <w:br/>
+        <w:t>O notebook também contém uma comparação exploratória de limiares no conjunto de teste. Essa tabela é exclusivamente descritiva: não foi utilizada para escolher, ajustar ou justificar o limiar final. A seleção oficial do valor 0,25 foi realizada somente com probabilidades fora da dobra na validação cruzada do conjunto de treinamento.</w:t>
+      </w:r>
     </w:p>
     <w:p>
       <w:pPr>
@@ -605,6 +615,12 @@
     <w:p>
       <w:r>
         <w:t>A classe positiva possui apenas 27 exemplos no conjunto de teste, portanto as métricas são sensíveis a poucos acertos ou erros. O melhor limiar foi escolhido entre candidatos predefinidos em validação cruzada, mas sua generalização deve ser verificada em novas amostras. A importância por permutação calculada no teste é uma análise interpretativa, não evidência causal. A diferença entre predict() e probabilidade &gt;= 0,50 decorreu de um caso exatamente no limiar, que foi classificado de maneira diferente.</w:t>
+      </w:r>
+      <w:r>
+        <w:t xml:space="preserve"> A tabela exploratória de limiares no teste não deve orientar ajustes posteriores nem ser confundida com o procedimento oficial de seleção.</w:t>
+      </w:r>
+      <w:r>
+        <w:t xml:space="preserve"> A comparação exploratória de limiares no teste não deve orientar ajustes posteriores nem ser confundida com o procedimento oficial de seleção.</w:t>
       </w:r>
     </w:p>
     <w:p>

</xml_diff>

<commit_message>
docs: remove repeticoes e aprimora relatorio da etapa 4
Remove trechos redundantes da documentação e mantém os esclarecimentos metodológicos sobre a seleção do limiar e a avaliação do modelo.
</commit_message>
<xml_diff>
--- a/Etapa 4/Relatorio_Machine_Learning_WineQT.docx
+++ b/Etapa 4/Relatorio_Machine_Learning_WineQT.docx
@@ -614,13 +614,7 @@
     </w:p>
     <w:p>
       <w:r>
-        <w:t>A classe positiva possui apenas 27 exemplos no conjunto de teste, portanto as métricas são sensíveis a poucos acertos ou erros. O melhor limiar foi escolhido entre candidatos predefinidos em validação cruzada, mas sua generalização deve ser verificada em novas amostras. A importância por permutação calculada no teste é uma análise interpretativa, não evidência causal. A diferença entre predict() e probabilidade &gt;= 0,50 decorreu de um caso exatamente no limiar, que foi classificado de maneira diferente.</w:t>
-      </w:r>
-      <w:r>
-        <w:t xml:space="preserve"> A tabela exploratória de limiares no teste não deve orientar ajustes posteriores nem ser confundida com o procedimento oficial de seleção.</w:t>
-      </w:r>
-      <w:r>
-        <w:t xml:space="preserve"> A comparação exploratória de limiares no teste não deve orientar ajustes posteriores nem ser confundida com o procedimento oficial de seleção.</w:t>
+        <w:t>A classe positiva possui apenas 27 exemplos no conjunto de teste, portanto as métricas são sensíveis a poucos acertos ou erros. O melhor limiar foi escolhido entre candidatos predefinidos em validação cruzada, mas sua generalização deve ser verificada em novas amostras. A importância por permutação calculada no teste é uma análise interpretativa, não evidência causal. A diferença entre predict() e probabilidade &gt;= 0,50 decorreu de um caso exatamente no limiar, que foi classificado de maneira diferente. A tabela exploratória de limiares no teste não deve orientar ajustes posteriores nem ser confundida com o procedimento oficial de seleção.</w:t>
       </w:r>
     </w:p>
     <w:p>

</xml_diff>